<commit_message>
Producao: pesquisa ignora acentos e pontuacao; semaforo so para em Arquivado
Decisoes do Paulo (2026-07-23) ao rever o questionario preenchido:

- A pesquisa passa a normalizar acentos e pontuacao dos dois lados da
  comparacao: "Marcia" com acento encontra "Marcia" sem acento (a base de
  dados nao tem acentos) e "26.1134" encontra o processo com underscores.
- "Obra fechada" = estado Arquivado. So Arquivado desliga o alerta de
  prazo; uma obra Finalizada pode estar por levantar ou por faturar e
  continua a avisar.
- Questionarios v2 atualizados: departamento de cada pessoa ja preenchido
  (Orcamentos vs Producao), lista da equipa corrigida (nao ha "Elsa"),
  pergunta do estado ja respondida e nota de que o perfil podera ser
  completado nas Configuracoes.

Co-Authored-By: Claude Opus 4.8 <noreply@anthropic.com>
</commit_message>
<xml_diff>
--- a/docs/ia_questionarios/Ensinar_assistente_Martelo_Ana.docx
+++ b/docs/ia_questionarios/Ensinar_assistente_Martelo_Ana.docx
@@ -365,14 +365,15 @@
         <w:tblLook w:firstColumn="1" w:firstRow="1" w:lastColumn="0" w:lastRow="0" w:noHBand="0" w:noVBand="1" w:val="04A0"/>
       </w:tblPr>
       <w:tblGrid>
-        <w:gridCol w:w="3213"/>
-        <w:gridCol w:w="3213"/>
-        <w:gridCol w:w="3213"/>
+        <w:gridCol w:w="2409"/>
+        <w:gridCol w:w="2409"/>
+        <w:gridCol w:w="2409"/>
+        <w:gridCol w:w="2409"/>
       </w:tblGrid>
       <w:tr>
         <w:tc>
           <w:tcPr>
-            <w:tcW w:type="dxa" w:w="2551"/>
+            <w:tcW w:type="dxa" w:w="1814"/>
             <w:shd w:val="clear" w:color="auto" w:fill="EFE7DA"/>
           </w:tcPr>
           <w:p>
@@ -394,7 +395,29 @@
         </w:tc>
         <w:tc>
           <w:tcPr>
-            <w:tcW w:type="dxa" w:w="5386"/>
+            <w:tcW w:type="dxa" w:w="2438"/>
+            <w:shd w:val="clear" w:color="auto" w:fill="EFE7DA"/>
+          </w:tcPr>
+          <w:p>
+            <w:pPr>
+              <w:spacing w:after="0"/>
+            </w:pPr>
+            <w:r/>
+            <w:r>
+              <w:rPr>
+                <w:rFonts w:ascii="Calibri" w:hAnsi="Calibri"/>
+                <w:b/>
+                <w:i w:val="0"/>
+                <w:color w:val="5A3E2B"/>
+                <w:sz w:val="20"/>
+              </w:rPr>
+              <w:t>Departamento</w:t>
+            </w:r>
+          </w:p>
+        </w:tc>
+        <w:tc>
+          <w:tcPr>
+            <w:tcW w:type="dxa" w:w="3685"/>
             <w:shd w:val="clear" w:color="auto" w:fill="EFE7DA"/>
           </w:tcPr>
           <w:p>
@@ -440,7 +463,7 @@
       <w:tr>
         <w:tc>
           <w:tcPr>
-            <w:tcW w:type="dxa" w:w="2551"/>
+            <w:tcW w:type="dxa" w:w="1814"/>
           </w:tcPr>
           <w:p>
             <w:pPr>
@@ -460,7 +483,27 @@
         </w:tc>
         <w:tc>
           <w:tcPr>
-            <w:tcW w:type="dxa" w:w="5386"/>
+            <w:tcW w:type="dxa" w:w="2438"/>
+          </w:tcPr>
+          <w:p>
+            <w:pPr>
+              <w:spacing w:after="0"/>
+            </w:pPr>
+            <w:r/>
+            <w:r>
+              <w:rPr>
+                <w:rFonts w:ascii="Calibri" w:hAnsi="Calibri"/>
+                <w:b w:val="0"/>
+                <w:i w:val="0"/>
+                <w:sz w:val="20"/>
+              </w:rPr>
+              <w:t>Produção — desenho das obras</w:t>
+            </w:r>
+          </w:p>
+        </w:tc>
+        <w:tc>
+          <w:tcPr>
+            <w:tcW w:type="dxa" w:w="3685"/>
           </w:tcPr>
           <w:p>
             <w:pPr>
@@ -486,6 +529,21 @@
       <w:pPr>
         <w:spacing w:after="80"/>
       </w:pPr>
+    </w:p>
+    <w:p>
+      <w:pPr>
+        <w:spacing w:after="120" w:before="0"/>
+      </w:pPr>
+      <w:r>
+        <w:rPr>
+          <w:rFonts w:ascii="Calibri" w:hAnsi="Calibri"/>
+          <w:b w:val="0"/>
+          <w:i/>
+          <w:color w:val="808080"/>
+          <w:sz w:val="21"/>
+        </w:rPr>
+        <w:t>O departamento já vem preenchido. Se estiver errado, corrige — serve para o assistente saber que perguntas fazem sentido para ti.</w:t>
+      </w:r>
     </w:p>
     <w:p>
       <w:pPr>
@@ -2310,12 +2368,12 @@
         <w:tc>
           <w:tcPr>
             <w:tcW w:type="dxa" w:w="9638"/>
-            <w:shd w:val="clear" w:color="auto" w:fill="FDF6E7"/>
+            <w:shd w:val="clear" w:color="auto" w:fill="FBF8F3"/>
             <w:tcBorders>
-              <w:left w:val="single" w:sz="24" w:color="8A5A00"/>
-              <w:top w:val="single" w:sz="4" w:color="8A5A00"/>
-              <w:bottom w:val="single" w:sz="4" w:color="8A5A00"/>
-              <w:right w:val="single" w:sz="4" w:color="8A5A00"/>
+              <w:left w:val="single" w:sz="24" w:color="5A3E2B"/>
+              <w:top w:val="single" w:sz="4" w:color="5A3E2B"/>
+              <w:bottom w:val="single" w:sz="4" w:color="5A3E2B"/>
+              <w:right w:val="single" w:sz="4" w:color="5A3E2B"/>
             </w:tcBorders>
           </w:tcPr>
           <w:p>
@@ -2328,10 +2386,10 @@
                 <w:rFonts w:ascii="Calibri" w:hAnsi="Calibri"/>
                 <w:b/>
                 <w:i w:val="0"/>
-                <w:color w:val="8A5A00"/>
+                <w:color w:val="5A3E2B"/>
                 <w:sz w:val="22"/>
               </w:rPr>
-              <w:t>Uma pergunta a que precisamos mesmo de resposta</w:t>
+              <w:t>Uma regra que já ficou decidida</w:t>
             </w:r>
           </w:p>
           <w:p>
@@ -2345,7 +2403,7 @@
                 <w:i w:val="0"/>
                 <w:sz w:val="21"/>
               </w:rPr>
-              <w:t>Quando dizes que uma obra «já está fechada» ou «já está despachada» — isso é Finalizado ou Arquivado? Escreve no quadro qual dos dois usas.</w:t>
+              <w:t>«Obra fechada» é o estado Arquivado.</w:t>
             </w:r>
           </w:p>
           <w:p>
@@ -2359,7 +2417,21 @@
                 <w:i w:val="0"/>
                 <w:sz w:val="21"/>
               </w:rPr>
-              <w:t>Isto é importante porque o Martelo deixa de dar alerta de atraso às obras Finalizadas e Arquivadas.</w:t>
+              <w:t>Por isso o Martelo deixa de dar alerta de atraso às obras Arquivadas. Uma obra Finalizada continua a ter alerta, porque pode estar por levantar ou por faturar.</w:t>
+            </w:r>
+          </w:p>
+          <w:p>
+            <w:pPr>
+              <w:spacing w:after="60"/>
+            </w:pPr>
+            <w:r>
+              <w:rPr>
+                <w:rFonts w:ascii="Calibri" w:hAnsi="Calibri"/>
+                <w:b w:val="0"/>
+                <w:i w:val="0"/>
+                <w:sz w:val="21"/>
+              </w:rPr>
+              <w:t>Se na tua área usarem estas palavras de outra maneira, escreve-o no quadro.</w:t>
             </w:r>
           </w:p>
         </w:tc>
@@ -2764,7 +2836,7 @@
           <w:i w:val="0"/>
           <w:sz w:val="21"/>
         </w:rPr>
-        <w:t>Os nomes da coluna da direita são os que estão escritos no Martelo — repara que são sem acentos. Na coluna da esquerda escreve como é que tratas cada pessoa na conversa: alcunhas, apelidos, nomes com acento, iniciais.</w:t>
+        <w:t>A coluna do meio tem os nomes como estão escritos no Martelo. Na coluna da esquerda escreve como tratas cada pessoa na conversa: alcunhas, apelidos, iniciais.</w:t>
       </w:r>
     </w:p>
     <w:p>
@@ -2779,7 +2851,7 @@
           <w:color w:val="808080"/>
           <w:sz w:val="21"/>
         </w:rPr>
-        <w:t>Exemplo do que nos interessa: se disseres «a Elsa» e no Martelo estiver «Elisabete», o assistente tem de saber que é a mesma pessoa.</w:t>
+        <w:t>Se tratares alguém por um nome que não é o que está no Martelo, o assistente tem de saber que é a mesma pessoa. Os acentos já não são problema: o Martelo passou a ignorá-los, «Márcia» encontra «Marcia».</w:t>
       </w:r>
     </w:p>
     <w:tbl>
@@ -2791,13 +2863,14 @@
         <w:tblLook w:firstColumn="1" w:firstRow="1" w:lastColumn="0" w:lastRow="0" w:noHBand="0" w:noVBand="1" w:val="04A0"/>
       </w:tblPr>
       <w:tblGrid>
-        <w:gridCol w:w="4819"/>
-        <w:gridCol w:w="4819"/>
+        <w:gridCol w:w="3213"/>
+        <w:gridCol w:w="3213"/>
+        <w:gridCol w:w="3213"/>
       </w:tblGrid>
       <w:tr>
         <w:tc>
           <w:tcPr>
-            <w:tcW w:type="dxa" w:w="4819"/>
+            <w:tcW w:type="dxa" w:w="3969"/>
             <w:shd w:val="clear" w:color="auto" w:fill="EFE7DA"/>
           </w:tcPr>
           <w:p>
@@ -2819,7 +2892,7 @@
         </w:tc>
         <w:tc>
           <w:tcPr>
-            <w:tcW w:type="dxa" w:w="4819"/>
+            <w:tcW w:type="dxa" w:w="2268"/>
             <w:shd w:val="clear" w:color="auto" w:fill="EFE7DA"/>
           </w:tcPr>
           <w:p>
@@ -2835,7 +2908,29 @@
                 <w:color w:val="5A3E2B"/>
                 <w:sz w:val="20"/>
               </w:rPr>
-              <w:t>Nome que está no Martelo</w:t>
+              <w:t>Nome no Martelo</w:t>
+            </w:r>
+          </w:p>
+        </w:tc>
+        <w:tc>
+          <w:tcPr>
+            <w:tcW w:type="dxa" w:w="3402"/>
+            <w:shd w:val="clear" w:color="auto" w:fill="EFE7DA"/>
+          </w:tcPr>
+          <w:p>
+            <w:pPr>
+              <w:spacing w:after="0"/>
+            </w:pPr>
+            <w:r/>
+            <w:r>
+              <w:rPr>
+                <w:rFonts w:ascii="Calibri" w:hAnsi="Calibri"/>
+                <w:b/>
+                <w:i w:val="0"/>
+                <w:color w:val="5A3E2B"/>
+                <w:sz w:val="20"/>
+              </w:rPr>
+              <w:t>Departamento</w:t>
             </w:r>
           </w:p>
         </w:tc>
@@ -2843,18 +2938,18 @@
       <w:tr>
         <w:tc>
           <w:tcPr>
-            <w:tcW w:type="dxa" w:w="4819"/>
-          </w:tcPr>
-          <w:p>
-            <w:pPr>
-              <w:spacing w:after="0"/>
-            </w:pPr>
-            <w:r/>
-          </w:p>
-        </w:tc>
-        <w:tc>
-          <w:tcPr>
-            <w:tcW w:type="dxa" w:w="4819"/>
+            <w:tcW w:type="dxa" w:w="3969"/>
+          </w:tcPr>
+          <w:p>
+            <w:pPr>
+              <w:spacing w:after="0"/>
+            </w:pPr>
+            <w:r/>
+          </w:p>
+        </w:tc>
+        <w:tc>
+          <w:tcPr>
+            <w:tcW w:type="dxa" w:w="2268"/>
           </w:tcPr>
           <w:p>
             <w:pPr>
@@ -2872,22 +2967,42 @@
             </w:r>
           </w:p>
         </w:tc>
+        <w:tc>
+          <w:tcPr>
+            <w:tcW w:type="dxa" w:w="3402"/>
+          </w:tcPr>
+          <w:p>
+            <w:pPr>
+              <w:spacing w:after="0"/>
+            </w:pPr>
+            <w:r/>
+            <w:r>
+              <w:rPr>
+                <w:rFonts w:ascii="Calibri" w:hAnsi="Calibri"/>
+                <w:b w:val="0"/>
+                <w:i w:val="0"/>
+                <w:sz w:val="20"/>
+              </w:rPr>
+              <w:t>Orçamentos e Produção</w:t>
+            </w:r>
+          </w:p>
+        </w:tc>
       </w:tr>
       <w:tr>
         <w:tc>
           <w:tcPr>
-            <w:tcW w:type="dxa" w:w="4819"/>
-          </w:tcPr>
-          <w:p>
-            <w:pPr>
-              <w:spacing w:after="0"/>
-            </w:pPr>
-            <w:r/>
-          </w:p>
-        </w:tc>
-        <w:tc>
-          <w:tcPr>
-            <w:tcW w:type="dxa" w:w="4819"/>
+            <w:tcW w:type="dxa" w:w="3969"/>
+          </w:tcPr>
+          <w:p>
+            <w:pPr>
+              <w:spacing w:after="0"/>
+            </w:pPr>
+            <w:r/>
+          </w:p>
+        </w:tc>
+        <w:tc>
+          <w:tcPr>
+            <w:tcW w:type="dxa" w:w="2268"/>
           </w:tcPr>
           <w:p>
             <w:pPr>
@@ -2905,22 +3020,42 @@
             </w:r>
           </w:p>
         </w:tc>
+        <w:tc>
+          <w:tcPr>
+            <w:tcW w:type="dxa" w:w="3402"/>
+          </w:tcPr>
+          <w:p>
+            <w:pPr>
+              <w:spacing w:after="0"/>
+            </w:pPr>
+            <w:r/>
+            <w:r>
+              <w:rPr>
+                <w:rFonts w:ascii="Calibri" w:hAnsi="Calibri"/>
+                <w:b w:val="0"/>
+                <w:i w:val="0"/>
+                <w:sz w:val="20"/>
+              </w:rPr>
+              <w:t>Produção — desenho das obras</w:t>
+            </w:r>
+          </w:p>
+        </w:tc>
       </w:tr>
       <w:tr>
         <w:tc>
           <w:tcPr>
-            <w:tcW w:type="dxa" w:w="4819"/>
-          </w:tcPr>
-          <w:p>
-            <w:pPr>
-              <w:spacing w:after="0"/>
-            </w:pPr>
-            <w:r/>
-          </w:p>
-        </w:tc>
-        <w:tc>
-          <w:tcPr>
-            <w:tcW w:type="dxa" w:w="4819"/>
+            <w:tcW w:type="dxa" w:w="3969"/>
+          </w:tcPr>
+          <w:p>
+            <w:pPr>
+              <w:spacing w:after="0"/>
+            </w:pPr>
+            <w:r/>
+          </w:p>
+        </w:tc>
+        <w:tc>
+          <w:tcPr>
+            <w:tcW w:type="dxa" w:w="2268"/>
           </w:tcPr>
           <w:p>
             <w:pPr>
@@ -2938,22 +3073,42 @@
             </w:r>
           </w:p>
         </w:tc>
+        <w:tc>
+          <w:tcPr>
+            <w:tcW w:type="dxa" w:w="3402"/>
+          </w:tcPr>
+          <w:p>
+            <w:pPr>
+              <w:spacing w:after="0"/>
+            </w:pPr>
+            <w:r/>
+            <w:r>
+              <w:rPr>
+                <w:rFonts w:ascii="Calibri" w:hAnsi="Calibri"/>
+                <w:b w:val="0"/>
+                <w:i w:val="0"/>
+                <w:sz w:val="20"/>
+              </w:rPr>
+              <w:t>Produção — desenho das obras</w:t>
+            </w:r>
+          </w:p>
+        </w:tc>
       </w:tr>
       <w:tr>
         <w:tc>
           <w:tcPr>
-            <w:tcW w:type="dxa" w:w="4819"/>
-          </w:tcPr>
-          <w:p>
-            <w:pPr>
-              <w:spacing w:after="0"/>
-            </w:pPr>
-            <w:r/>
-          </w:p>
-        </w:tc>
-        <w:tc>
-          <w:tcPr>
-            <w:tcW w:type="dxa" w:w="4819"/>
+            <w:tcW w:type="dxa" w:w="3969"/>
+          </w:tcPr>
+          <w:p>
+            <w:pPr>
+              <w:spacing w:after="0"/>
+            </w:pPr>
+            <w:r/>
+          </w:p>
+        </w:tc>
+        <w:tc>
+          <w:tcPr>
+            <w:tcW w:type="dxa" w:w="2268"/>
           </w:tcPr>
           <w:p>
             <w:pPr>
@@ -2971,22 +3126,42 @@
             </w:r>
           </w:p>
         </w:tc>
+        <w:tc>
+          <w:tcPr>
+            <w:tcW w:type="dxa" w:w="3402"/>
+          </w:tcPr>
+          <w:p>
+            <w:pPr>
+              <w:spacing w:after="0"/>
+            </w:pPr>
+            <w:r/>
+            <w:r>
+              <w:rPr>
+                <w:rFonts w:ascii="Calibri" w:hAnsi="Calibri"/>
+                <w:b w:val="0"/>
+                <w:i w:val="0"/>
+                <w:sz w:val="20"/>
+              </w:rPr>
+              <w:t>Produção — desenho das obras</w:t>
+            </w:r>
+          </w:p>
+        </w:tc>
       </w:tr>
       <w:tr>
         <w:tc>
           <w:tcPr>
-            <w:tcW w:type="dxa" w:w="4819"/>
-          </w:tcPr>
-          <w:p>
-            <w:pPr>
-              <w:spacing w:after="0"/>
-            </w:pPr>
-            <w:r/>
-          </w:p>
-        </w:tc>
-        <w:tc>
-          <w:tcPr>
-            <w:tcW w:type="dxa" w:w="4819"/>
+            <w:tcW w:type="dxa" w:w="3969"/>
+          </w:tcPr>
+          <w:p>
+            <w:pPr>
+              <w:spacing w:after="0"/>
+            </w:pPr>
+            <w:r/>
+          </w:p>
+        </w:tc>
+        <w:tc>
+          <w:tcPr>
+            <w:tcW w:type="dxa" w:w="2268"/>
           </w:tcPr>
           <w:p>
             <w:pPr>
@@ -3004,22 +3179,42 @@
             </w:r>
           </w:p>
         </w:tc>
+        <w:tc>
+          <w:tcPr>
+            <w:tcW w:type="dxa" w:w="3402"/>
+          </w:tcPr>
+          <w:p>
+            <w:pPr>
+              <w:spacing w:after="0"/>
+            </w:pPr>
+            <w:r/>
+            <w:r>
+              <w:rPr>
+                <w:rFonts w:ascii="Calibri" w:hAnsi="Calibri"/>
+                <w:b w:val="0"/>
+                <w:i w:val="0"/>
+                <w:sz w:val="20"/>
+              </w:rPr>
+              <w:t>Produção — desenho das obras</w:t>
+            </w:r>
+          </w:p>
+        </w:tc>
       </w:tr>
       <w:tr>
         <w:tc>
           <w:tcPr>
-            <w:tcW w:type="dxa" w:w="4819"/>
-          </w:tcPr>
-          <w:p>
-            <w:pPr>
-              <w:spacing w:after="0"/>
-            </w:pPr>
-            <w:r/>
-          </w:p>
-        </w:tc>
-        <w:tc>
-          <w:tcPr>
-            <w:tcW w:type="dxa" w:w="4819"/>
+            <w:tcW w:type="dxa" w:w="3969"/>
+          </w:tcPr>
+          <w:p>
+            <w:pPr>
+              <w:spacing w:after="0"/>
+            </w:pPr>
+            <w:r/>
+          </w:p>
+        </w:tc>
+        <w:tc>
+          <w:tcPr>
+            <w:tcW w:type="dxa" w:w="2268"/>
           </w:tcPr>
           <w:p>
             <w:pPr>
@@ -3037,22 +3232,42 @@
             </w:r>
           </w:p>
         </w:tc>
+        <w:tc>
+          <w:tcPr>
+            <w:tcW w:type="dxa" w:w="3402"/>
+          </w:tcPr>
+          <w:p>
+            <w:pPr>
+              <w:spacing w:after="0"/>
+            </w:pPr>
+            <w:r/>
+            <w:r>
+              <w:rPr>
+                <w:rFonts w:ascii="Calibri" w:hAnsi="Calibri"/>
+                <w:b w:val="0"/>
+                <w:i w:val="0"/>
+                <w:sz w:val="20"/>
+              </w:rPr>
+              <w:t>Produção — desenho das obras</w:t>
+            </w:r>
+          </w:p>
+        </w:tc>
       </w:tr>
       <w:tr>
         <w:tc>
           <w:tcPr>
-            <w:tcW w:type="dxa" w:w="4819"/>
-          </w:tcPr>
-          <w:p>
-            <w:pPr>
-              <w:spacing w:after="0"/>
-            </w:pPr>
-            <w:r/>
-          </w:p>
-        </w:tc>
-        <w:tc>
-          <w:tcPr>
-            <w:tcW w:type="dxa" w:w="4819"/>
+            <w:tcW w:type="dxa" w:w="3969"/>
+          </w:tcPr>
+          <w:p>
+            <w:pPr>
+              <w:spacing w:after="0"/>
+            </w:pPr>
+            <w:r/>
+          </w:p>
+        </w:tc>
+        <w:tc>
+          <w:tcPr>
+            <w:tcW w:type="dxa" w:w="2268"/>
           </w:tcPr>
           <w:p>
             <w:pPr>
@@ -3070,22 +3285,42 @@
             </w:r>
           </w:p>
         </w:tc>
+        <w:tc>
+          <w:tcPr>
+            <w:tcW w:type="dxa" w:w="3402"/>
+          </w:tcPr>
+          <w:p>
+            <w:pPr>
+              <w:spacing w:after="0"/>
+            </w:pPr>
+            <w:r/>
+            <w:r>
+              <w:rPr>
+                <w:rFonts w:ascii="Calibri" w:hAnsi="Calibri"/>
+                <w:b w:val="0"/>
+                <w:i w:val="0"/>
+                <w:sz w:val="20"/>
+              </w:rPr>
+              <w:t>Produção — desenho das obras</w:t>
+            </w:r>
+          </w:p>
+        </w:tc>
       </w:tr>
       <w:tr>
         <w:tc>
           <w:tcPr>
-            <w:tcW w:type="dxa" w:w="4819"/>
-          </w:tcPr>
-          <w:p>
-            <w:pPr>
-              <w:spacing w:after="0"/>
-            </w:pPr>
-            <w:r/>
-          </w:p>
-        </w:tc>
-        <w:tc>
-          <w:tcPr>
-            <w:tcW w:type="dxa" w:w="4819"/>
+            <w:tcW w:type="dxa" w:w="3969"/>
+          </w:tcPr>
+          <w:p>
+            <w:pPr>
+              <w:spacing w:after="0"/>
+            </w:pPr>
+            <w:r/>
+          </w:p>
+        </w:tc>
+        <w:tc>
+          <w:tcPr>
+            <w:tcW w:type="dxa" w:w="2268"/>
           </w:tcPr>
           <w:p>
             <w:pPr>
@@ -3103,22 +3338,42 @@
             </w:r>
           </w:p>
         </w:tc>
+        <w:tc>
+          <w:tcPr>
+            <w:tcW w:type="dxa" w:w="3402"/>
+          </w:tcPr>
+          <w:p>
+            <w:pPr>
+              <w:spacing w:after="0"/>
+            </w:pPr>
+            <w:r/>
+            <w:r>
+              <w:rPr>
+                <w:rFonts w:ascii="Calibri" w:hAnsi="Calibri"/>
+                <w:b w:val="0"/>
+                <w:i w:val="0"/>
+                <w:sz w:val="20"/>
+              </w:rPr>
+              <w:t>Orçamentos</w:t>
+            </w:r>
+          </w:p>
+        </w:tc>
       </w:tr>
       <w:tr>
         <w:tc>
           <w:tcPr>
-            <w:tcW w:type="dxa" w:w="4819"/>
-          </w:tcPr>
-          <w:p>
-            <w:pPr>
-              <w:spacing w:after="0"/>
-            </w:pPr>
-            <w:r/>
-          </w:p>
-        </w:tc>
-        <w:tc>
-          <w:tcPr>
-            <w:tcW w:type="dxa" w:w="4819"/>
+            <w:tcW w:type="dxa" w:w="3969"/>
+          </w:tcPr>
+          <w:p>
+            <w:pPr>
+              <w:spacing w:after="0"/>
+            </w:pPr>
+            <w:r/>
+          </w:p>
+        </w:tc>
+        <w:tc>
+          <w:tcPr>
+            <w:tcW w:type="dxa" w:w="2268"/>
           </w:tcPr>
           <w:p>
             <w:pPr>
@@ -3136,22 +3391,42 @@
             </w:r>
           </w:p>
         </w:tc>
+        <w:tc>
+          <w:tcPr>
+            <w:tcW w:type="dxa" w:w="3402"/>
+          </w:tcPr>
+          <w:p>
+            <w:pPr>
+              <w:spacing w:after="0"/>
+            </w:pPr>
+            <w:r/>
+            <w:r>
+              <w:rPr>
+                <w:rFonts w:ascii="Calibri" w:hAnsi="Calibri"/>
+                <w:b w:val="0"/>
+                <w:i w:val="0"/>
+                <w:sz w:val="20"/>
+              </w:rPr>
+              <w:t>Orçamentos</w:t>
+            </w:r>
+          </w:p>
+        </w:tc>
       </w:tr>
       <w:tr>
         <w:tc>
           <w:tcPr>
-            <w:tcW w:type="dxa" w:w="4819"/>
-          </w:tcPr>
-          <w:p>
-            <w:pPr>
-              <w:spacing w:after="0"/>
-            </w:pPr>
-            <w:r/>
-          </w:p>
-        </w:tc>
-        <w:tc>
-          <w:tcPr>
-            <w:tcW w:type="dxa" w:w="4819"/>
+            <w:tcW w:type="dxa" w:w="3969"/>
+          </w:tcPr>
+          <w:p>
+            <w:pPr>
+              <w:spacing w:after="0"/>
+            </w:pPr>
+            <w:r/>
+          </w:p>
+        </w:tc>
+        <w:tc>
+          <w:tcPr>
+            <w:tcW w:type="dxa" w:w="2268"/>
           </w:tcPr>
           <w:p>
             <w:pPr>
@@ -3169,22 +3444,53 @@
             </w:r>
           </w:p>
         </w:tc>
+        <w:tc>
+          <w:tcPr>
+            <w:tcW w:type="dxa" w:w="3402"/>
+          </w:tcPr>
+          <w:p>
+            <w:pPr>
+              <w:spacing w:after="0"/>
+            </w:pPr>
+            <w:r/>
+            <w:r>
+              <w:rPr>
+                <w:rFonts w:ascii="Calibri" w:hAnsi="Calibri"/>
+                <w:b w:val="0"/>
+                <w:i w:val="0"/>
+                <w:sz w:val="20"/>
+              </w:rPr>
+              <w:t>Orçamentos</w:t>
+            </w:r>
+          </w:p>
+        </w:tc>
       </w:tr>
       <w:tr>
         <w:tc>
           <w:tcPr>
-            <w:tcW w:type="dxa" w:w="4819"/>
-          </w:tcPr>
-          <w:p>
-            <w:pPr>
-              <w:spacing w:after="0"/>
-            </w:pPr>
-            <w:r/>
-          </w:p>
-        </w:tc>
-        <w:tc>
-          <w:tcPr>
-            <w:tcW w:type="dxa" w:w="4819"/>
+            <w:tcW w:type="dxa" w:w="3969"/>
+          </w:tcPr>
+          <w:p>
+            <w:pPr>
+              <w:spacing w:after="0"/>
+            </w:pPr>
+            <w:r/>
+          </w:p>
+        </w:tc>
+        <w:tc>
+          <w:tcPr>
+            <w:tcW w:type="dxa" w:w="2268"/>
+          </w:tcPr>
+          <w:p>
+            <w:pPr>
+              <w:spacing w:after="0"/>
+            </w:pPr>
+            <w:r/>
+          </w:p>
+        </w:tc>
+        <w:tc>
+          <w:tcPr>
+            <w:tcW w:type="dxa" w:w="3402"/>
           </w:tcPr>
           <w:p>
             <w:pPr>
@@ -3197,18 +3503,29 @@
       <w:tr>
         <w:tc>
           <w:tcPr>
-            <w:tcW w:type="dxa" w:w="4819"/>
-          </w:tcPr>
-          <w:p>
-            <w:pPr>
-              <w:spacing w:after="0"/>
-            </w:pPr>
-            <w:r/>
-          </w:p>
-        </w:tc>
-        <w:tc>
-          <w:tcPr>
-            <w:tcW w:type="dxa" w:w="4819"/>
+            <w:tcW w:type="dxa" w:w="3969"/>
+          </w:tcPr>
+          <w:p>
+            <w:pPr>
+              <w:spacing w:after="0"/>
+            </w:pPr>
+            <w:r/>
+          </w:p>
+        </w:tc>
+        <w:tc>
+          <w:tcPr>
+            <w:tcW w:type="dxa" w:w="2268"/>
+          </w:tcPr>
+          <w:p>
+            <w:pPr>
+              <w:spacing w:after="0"/>
+            </w:pPr>
+            <w:r/>
+          </w:p>
+        </w:tc>
+        <w:tc>
+          <w:tcPr>
+            <w:tcW w:type="dxa" w:w="3402"/>
           </w:tcPr>
           <w:p>
             <w:pPr>
@@ -3221,18 +3538,29 @@
       <w:tr>
         <w:tc>
           <w:tcPr>
-            <w:tcW w:type="dxa" w:w="4819"/>
-          </w:tcPr>
-          <w:p>
-            <w:pPr>
-              <w:spacing w:after="0"/>
-            </w:pPr>
-            <w:r/>
-          </w:p>
-        </w:tc>
-        <w:tc>
-          <w:tcPr>
-            <w:tcW w:type="dxa" w:w="4819"/>
+            <w:tcW w:type="dxa" w:w="3969"/>
+          </w:tcPr>
+          <w:p>
+            <w:pPr>
+              <w:spacing w:after="0"/>
+            </w:pPr>
+            <w:r/>
+          </w:p>
+        </w:tc>
+        <w:tc>
+          <w:tcPr>
+            <w:tcW w:type="dxa" w:w="2268"/>
+          </w:tcPr>
+          <w:p>
+            <w:pPr>
+              <w:spacing w:after="0"/>
+            </w:pPr>
+            <w:r/>
+          </w:p>
+        </w:tc>
+        <w:tc>
+          <w:tcPr>
+            <w:tcW w:type="dxa" w:w="3402"/>
           </w:tcPr>
           <w:p>
             <w:pPr>
@@ -7659,7 +7987,21 @@
                 <w:i w:val="0"/>
                 <w:sz w:val="21"/>
               </w:rPr>
-              <w:t>Se te lembrares de mais alguma coisa depois de entregares, diz na mesma. Este perfil vai sendo melhorado à medida que formos usando o assistente.</w:t>
+              <w:t>Não é preciso ter tudo decidido hoje. O Martelo vai passar a ter uma área da IA nas Configurações, onde cada um poderá ir acrescentando palavras e avisos ao seu perfil à medida que se for lembrando.</w:t>
+            </w:r>
+          </w:p>
+          <w:p>
+            <w:pPr>
+              <w:spacing w:after="60"/>
+            </w:pPr>
+            <w:r>
+              <w:rPr>
+                <w:rFonts w:ascii="Calibri" w:hAnsi="Calibri"/>
+                <w:b w:val="0"/>
+                <w:i w:val="0"/>
+                <w:sz w:val="21"/>
+              </w:rPr>
+              <w:t>Por isso, quadros em branco não são problema — são coisas para completar depois, quando te ocorrerem.</w:t>
             </w:r>
           </w:p>
         </w:tc>

</xml_diff>